<commit_message>
Detalles en la documentación
</commit_message>
<xml_diff>
--- a/DocumentaciónEv3.docx
+++ b/DocumentaciónEv3.docx
@@ -1851,8 +1851,55 @@
         </w:rPr>
       </w:r>
     </w:p>
+    <w:p>
+      <w:pPr>
+        <w:pStyle w:val="Heading2"/>
+        <w:rPr/>
+      </w:pPr>
+      <w:bookmarkStart w:colFirst="0" w:colLast="0" w:name="_74jyafeh8x49" w:id="18"/>
+      <w:bookmarkEnd w:id="18"/>
+      <w:r>
+        <w:rPr>
+          <w:rtl w:val="0"/>
+        </w:rPr>
+      </w:r>
+    </w:p>
+    <w:p>
+      <w:pPr>
+        <w:pStyle w:val="Heading2"/>
+        <w:rPr/>
+      </w:pPr>
+      <w:bookmarkStart w:colFirst="0" w:colLast="0" w:name="_pzum9f7vz71v" w:id="19"/>
+      <w:bookmarkEnd w:id="19"/>
+      <w:r>
+        <w:rPr>
+          <w:rtl w:val="0"/>
+        </w:rPr>
+        <w:t xml:space="preserve">Github Colaborativo</w:t>
+      </w:r>
+    </w:p>
+    <w:p>
+      <w:pPr>
+        <w:rPr/>
+      </w:pPr>
+      <w:hyperlink r:id="rId8">
+        <w:r>
+          <w:rPr>
+            <w:color w:val="1155cc"/>
+            <w:u w:val="single"/>
+            <w:rtl w:val="0"/>
+          </w:rPr>
+          <w:t xml:space="preserve">Link GitHub Evaluación 3</w:t>
+        </w:r>
+      </w:hyperlink>
+      <w:r>
+        <w:rPr>
+          <w:rtl w:val="0"/>
+        </w:rPr>
+      </w:r>
+    </w:p>
     <w:sectPr>
-      <w:headerReference r:id="rId8" w:type="default"/>
+      <w:headerReference r:id="rId9" w:type="default"/>
       <w:pgSz w:h="16834" w:w="11909" w:orient="portrait"/>
       <w:pgMar w:bottom="1440" w:top="1440" w:left="1440" w:right="1440" w:header="720" w:footer="720"/>
       <w:pgNumType w:start="1"/>
@@ -1869,8 +1916,8 @@
       <w:jc w:val="right"/>
       <w:rPr/>
     </w:pPr>
-    <w:bookmarkStart w:colFirst="0" w:colLast="0" w:name="_v8uhpe17s4x9" w:id="18"/>
-    <w:bookmarkEnd w:id="18"/>
+    <w:bookmarkStart w:colFirst="0" w:colLast="0" w:name="_v8uhpe17s4x9" w:id="20"/>
+    <w:bookmarkEnd w:id="20"/>
     <w:r>
       <w:rPr>
         <w:rtl w:val="0"/>

</xml_diff>